<commit_message>
feat: replace Qdrant retrieval with local docx file loading
</commit_message>
<xml_diff>
--- a/data/rag_file.docx
+++ b/data/rag_file.docx
@@ -849,9 +849,244 @@
       <w:pPr>
         <w:pStyle w:val="NormalWeb"/>
       </w:pPr>
+      <w:proofErr w:type="gramStart"/>
       <w:r>
         <w:t>A modern, responsive business website.</w:t>
       </w:r>
+      <w:proofErr w:type="gramEnd"/>
+    </w:p>
+    <w:p>
+      <w:pPr>
+        <w:pStyle w:val="Heading2"/>
+        <w:rPr>
+          <w:rFonts w:ascii="Times New Roman" w:eastAsia="Times New Roman" w:hAnsi="Times New Roman" w:cs="Times New Roman"/>
+          <w:b/>
+          <w:bCs/>
+          <w:color w:val="auto"/>
+          <w:sz w:val="36"/>
+          <w:szCs w:val="36"/>
+        </w:rPr>
+      </w:pPr>
+      <w:r>
+        <w:lastRenderedPageBreak/>
+        <w:t>6</w:t>
+      </w:r>
+      <w:r>
+        <w:t xml:space="preserve">. </w:t>
+      </w:r>
+      <w:r>
+        <w:rPr>
+          <w:rFonts w:ascii="Times New Roman" w:eastAsia="Times New Roman" w:hAnsi="Times New Roman" w:cs="Times New Roman"/>
+          <w:b/>
+          <w:bCs/>
+          <w:color w:val="auto"/>
+          <w:sz w:val="36"/>
+          <w:szCs w:val="36"/>
+        </w:rPr>
+        <w:t>Computerized Maintenance Management System (CMMS)</w:t>
+      </w:r>
+    </w:p>
+    <w:p>
+      <w:pPr>
+        <w:spacing w:before="100" w:beforeAutospacing="1" w:after="100" w:afterAutospacing="1"/>
+        <w:rPr>
+          <w:rFonts w:ascii="Times New Roman" w:eastAsia="Times New Roman" w:hAnsi="Times New Roman" w:cs="Times New Roman"/>
+        </w:rPr>
+      </w:pPr>
+      <w:r>
+        <w:rPr>
+          <w:rFonts w:ascii="Times New Roman" w:eastAsia="Times New Roman" w:hAnsi="Times New Roman" w:cs="Times New Roman"/>
+          <w:b/>
+          <w:bCs/>
+        </w:rPr>
+        <w:t>Role:</w:t>
+      </w:r>
+      <w:r>
+        <w:rPr>
+          <w:rFonts w:ascii="Times New Roman" w:eastAsia="Times New Roman" w:hAnsi="Times New Roman" w:cs="Times New Roman"/>
+        </w:rPr>
+        <w:t xml:space="preserve"> Full-Stack Architect &amp; Developer</w:t>
+      </w:r>
+    </w:p>
+    <w:p>
+      <w:pPr>
+        <w:spacing w:before="100" w:beforeAutospacing="1" w:after="100" w:afterAutospacing="1"/>
+        <w:rPr>
+          <w:rFonts w:ascii="Times New Roman" w:eastAsia="Times New Roman" w:hAnsi="Times New Roman" w:cs="Times New Roman"/>
+        </w:rPr>
+      </w:pPr>
+      <w:r>
+        <w:rPr>
+          <w:rFonts w:ascii="Times New Roman" w:eastAsia="Times New Roman" w:hAnsi="Times New Roman" w:cs="Times New Roman"/>
+          <w:b/>
+          <w:bCs/>
+        </w:rPr>
+        <w:t>Tech Stack:</w:t>
+      </w:r>
+      <w:r>
+        <w:rPr>
+          <w:rFonts w:ascii="Times New Roman" w:eastAsia="Times New Roman" w:hAnsi="Times New Roman" w:cs="Times New Roman"/>
+        </w:rPr>
+        <w:t xml:space="preserve"> Angular, Spring Boot, Relational Database</w:t>
+      </w:r>
+    </w:p>
+    <w:p>
+      <w:pPr>
+        <w:spacing w:before="100" w:beforeAutospacing="1" w:after="100" w:afterAutospacing="1"/>
+        <w:rPr>
+          <w:rFonts w:ascii="Times New Roman" w:eastAsia="Times New Roman" w:hAnsi="Times New Roman" w:cs="Times New Roman"/>
+        </w:rPr>
+      </w:pPr>
+      <w:r>
+        <w:rPr>
+          <w:rFonts w:ascii="Times New Roman" w:eastAsia="Times New Roman" w:hAnsi="Times New Roman" w:cs="Times New Roman"/>
+          <w:b/>
+          <w:bCs/>
+        </w:rPr>
+        <w:t>Project Overview</w:t>
+      </w:r>
+    </w:p>
+    <w:p>
+      <w:pPr>
+        <w:spacing w:before="100" w:beforeAutospacing="1" w:after="100" w:afterAutospacing="1"/>
+        <w:rPr>
+          <w:rFonts w:ascii="Times New Roman" w:eastAsia="Times New Roman" w:hAnsi="Times New Roman" w:cs="Times New Roman"/>
+        </w:rPr>
+      </w:pPr>
+      <w:r>
+        <w:rPr>
+          <w:rFonts w:ascii="Times New Roman" w:eastAsia="Times New Roman" w:hAnsi="Times New Roman" w:cs="Times New Roman"/>
+        </w:rPr>
+        <w:t>Architected and planned an end-to-end Computerized Maintenance Management System tailored specifically for enterprise generator asset management. The platform serves as a centralized hub to track physical assets, automate maintenance schedules, and monitor resource consumption, ultimately minimizing equipment downtime and ensuring operational continuity.</w:t>
+      </w:r>
+    </w:p>
+    <w:p>
+      <w:pPr>
+        <w:spacing w:before="100" w:beforeAutospacing="1" w:after="100" w:afterAutospacing="1"/>
+        <w:rPr>
+          <w:rFonts w:ascii="Times New Roman" w:eastAsia="Times New Roman" w:hAnsi="Times New Roman" w:cs="Times New Roman"/>
+        </w:rPr>
+      </w:pPr>
+      <w:r>
+        <w:rPr>
+          <w:rFonts w:ascii="Times New Roman" w:eastAsia="Times New Roman" w:hAnsi="Times New Roman" w:cs="Times New Roman"/>
+          <w:b/>
+          <w:bCs/>
+        </w:rPr>
+        <w:t>Core Features</w:t>
+      </w:r>
+    </w:p>
+    <w:p>
+      <w:pPr>
+        <w:numPr>
+          <w:ilvl w:val="0"/>
+          <w:numId w:val="14"/>
+        </w:numPr>
+        <w:spacing w:before="100" w:beforeAutospacing="1" w:after="100" w:afterAutospacing="1"/>
+        <w:rPr>
+          <w:rFonts w:ascii="Times New Roman" w:eastAsia="Times New Roman" w:hAnsi="Times New Roman" w:cs="Times New Roman"/>
+        </w:rPr>
+      </w:pPr>
+      <w:r>
+        <w:rPr>
+          <w:rFonts w:ascii="Times New Roman" w:eastAsia="Times New Roman" w:hAnsi="Times New Roman" w:cs="Times New Roman"/>
+          <w:b/>
+          <w:bCs/>
+        </w:rPr>
+        <w:t>Asset Lifecycle Tracking:</w:t>
+      </w:r>
+      <w:r>
+        <w:rPr>
+          <w:rFonts w:ascii="Times New Roman" w:eastAsia="Times New Roman" w:hAnsi="Times New Roman" w:cs="Times New Roman"/>
+        </w:rPr>
+        <w:t xml:space="preserve"> Comprehensive monitoring and logging of generator assets across various deployment locations.</w:t>
+      </w:r>
+    </w:p>
+    <w:p>
+      <w:pPr>
+        <w:numPr>
+          <w:ilvl w:val="0"/>
+          <w:numId w:val="14"/>
+        </w:numPr>
+        <w:spacing w:before="100" w:beforeAutospacing="1" w:after="100" w:afterAutospacing="1"/>
+        <w:rPr>
+          <w:rFonts w:ascii="Times New Roman" w:eastAsia="Times New Roman" w:hAnsi="Times New Roman" w:cs="Times New Roman"/>
+        </w:rPr>
+      </w:pPr>
+      <w:r>
+        <w:rPr>
+          <w:rFonts w:ascii="Times New Roman" w:eastAsia="Times New Roman" w:hAnsi="Times New Roman" w:cs="Times New Roman"/>
+          <w:b/>
+          <w:bCs/>
+        </w:rPr>
+        <w:t>Preventive Maintenance Engine:</w:t>
+      </w:r>
+      <w:r>
+        <w:rPr>
+          <w:rFonts w:ascii="Times New Roman" w:eastAsia="Times New Roman" w:hAnsi="Times New Roman" w:cs="Times New Roman"/>
+        </w:rPr>
+        <w:t xml:space="preserve"> Automated scheduling system for routine maintenance tasks, shifting operations from reactive repairs to proactive equipment care.</w:t>
+      </w:r>
+    </w:p>
+    <w:p>
+      <w:pPr>
+        <w:numPr>
+          <w:ilvl w:val="0"/>
+          <w:numId w:val="14"/>
+        </w:numPr>
+        <w:spacing w:before="100" w:beforeAutospacing="1" w:after="100" w:afterAutospacing="1"/>
+        <w:rPr>
+          <w:rFonts w:ascii="Times New Roman" w:eastAsia="Times New Roman" w:hAnsi="Times New Roman" w:cs="Times New Roman"/>
+        </w:rPr>
+      </w:pPr>
+      <w:r>
+        <w:rPr>
+          <w:rFonts w:ascii="Times New Roman" w:eastAsia="Times New Roman" w:hAnsi="Times New Roman" w:cs="Times New Roman"/>
+          <w:b/>
+          <w:bCs/>
+        </w:rPr>
+        <w:t>Fuel Monitoring Module:</w:t>
+      </w:r>
+      <w:r>
+        <w:rPr>
+          <w:rFonts w:ascii="Times New Roman" w:eastAsia="Times New Roman" w:hAnsi="Times New Roman" w:cs="Times New Roman"/>
+        </w:rPr>
+        <w:t xml:space="preserve"> Dedicated tracking of fuel co</w:t>
+      </w:r>
+      <w:bookmarkStart w:id="1" w:name="_GoBack"/>
+      <w:bookmarkEnd w:id="1"/>
+      <w:r>
+        <w:rPr>
+          <w:rFonts w:ascii="Times New Roman" w:eastAsia="Times New Roman" w:hAnsi="Times New Roman" w:cs="Times New Roman"/>
+        </w:rPr>
+        <w:t>nsumption metrics to identify usage anomalies, prevent resource shrinkage, and forecast supply requirements.</w:t>
+      </w:r>
+    </w:p>
+    <w:p>
+      <w:pPr>
+        <w:numPr>
+          <w:ilvl w:val="0"/>
+          <w:numId w:val="14"/>
+        </w:numPr>
+        <w:spacing w:before="100" w:beforeAutospacing="1" w:after="100" w:afterAutospacing="1"/>
+        <w:rPr>
+          <w:rFonts w:ascii="Times New Roman" w:eastAsia="Times New Roman" w:hAnsi="Times New Roman" w:cs="Times New Roman"/>
+        </w:rPr>
+      </w:pPr>
+      <w:r>
+        <w:rPr>
+          <w:rFonts w:ascii="Times New Roman" w:eastAsia="Times New Roman" w:hAnsi="Times New Roman" w:cs="Times New Roman"/>
+          <w:b/>
+          <w:bCs/>
+        </w:rPr>
+        <w:t>SLA Enforcement:</w:t>
+      </w:r>
+      <w:r>
+        <w:rPr>
+          <w:rFonts w:ascii="Times New Roman" w:eastAsia="Times New Roman" w:hAnsi="Times New Roman" w:cs="Times New Roman"/>
+        </w:rPr>
+        <w:t xml:space="preserve"> Integrated dashboards to track service provider performance and compliance against contracted Service Level Agreements.</w:t>
+      </w:r>
     </w:p>
     <w:p>
       <w:pPr>
@@ -861,7 +1096,6 @@
         <w:rPr>
           <w:rStyle w:val="Strong"/>
         </w:rPr>
-        <w:lastRenderedPageBreak/>
         <w:t>Key Features:</w:t>
       </w:r>
     </w:p>
@@ -955,8 +1189,6 @@
         <w:br/>
         <w:t>Phone: +251975574718</w:t>
       </w:r>
-      <w:bookmarkStart w:id="1" w:name="_GoBack"/>
-      <w:bookmarkEnd w:id="1"/>
     </w:p>
     <w:p/>
     <w:sectPr>
@@ -1304,6 +1536,155 @@
     </w:lvl>
   </w:abstractNum>
   <w:abstractNum w:abstractNumId="3">
+    <w:nsid w:val="29735309"/>
+    <w:multiLevelType w:val="multilevel"/>
+    <w:tmpl w:val="93CEDC20"/>
+    <w:lvl w:ilvl="0">
+      <w:start w:val="1"/>
+      <w:numFmt w:val="bullet"/>
+      <w:lvlText w:val=""/>
+      <w:lvlJc w:val="left"/>
+      <w:pPr>
+        <w:tabs>
+          <w:tab w:val="num" w:pos="720"/>
+        </w:tabs>
+        <w:ind w:left="720" w:hanging="360"/>
+      </w:pPr>
+      <w:rPr>
+        <w:rFonts w:ascii="Symbol" w:hAnsi="Symbol" w:hint="default"/>
+        <w:sz w:val="20"/>
+      </w:rPr>
+    </w:lvl>
+    <w:lvl w:ilvl="1" w:tentative="1">
+      <w:start w:val="1"/>
+      <w:numFmt w:val="bullet"/>
+      <w:lvlText w:val="o"/>
+      <w:lvlJc w:val="left"/>
+      <w:pPr>
+        <w:tabs>
+          <w:tab w:val="num" w:pos="1440"/>
+        </w:tabs>
+        <w:ind w:left="1440" w:hanging="360"/>
+      </w:pPr>
+      <w:rPr>
+        <w:rFonts w:ascii="Courier New" w:hAnsi="Courier New" w:hint="default"/>
+        <w:sz w:val="20"/>
+      </w:rPr>
+    </w:lvl>
+    <w:lvl w:ilvl="2" w:tentative="1">
+      <w:start w:val="1"/>
+      <w:numFmt w:val="bullet"/>
+      <w:lvlText w:val=""/>
+      <w:lvlJc w:val="left"/>
+      <w:pPr>
+        <w:tabs>
+          <w:tab w:val="num" w:pos="2160"/>
+        </w:tabs>
+        <w:ind w:left="2160" w:hanging="360"/>
+      </w:pPr>
+      <w:rPr>
+        <w:rFonts w:ascii="Wingdings" w:hAnsi="Wingdings" w:hint="default"/>
+        <w:sz w:val="20"/>
+      </w:rPr>
+    </w:lvl>
+    <w:lvl w:ilvl="3" w:tentative="1">
+      <w:start w:val="1"/>
+      <w:numFmt w:val="bullet"/>
+      <w:lvlText w:val=""/>
+      <w:lvlJc w:val="left"/>
+      <w:pPr>
+        <w:tabs>
+          <w:tab w:val="num" w:pos="2880"/>
+        </w:tabs>
+        <w:ind w:left="2880" w:hanging="360"/>
+      </w:pPr>
+      <w:rPr>
+        <w:rFonts w:ascii="Wingdings" w:hAnsi="Wingdings" w:hint="default"/>
+        <w:sz w:val="20"/>
+      </w:rPr>
+    </w:lvl>
+    <w:lvl w:ilvl="4" w:tentative="1">
+      <w:start w:val="1"/>
+      <w:numFmt w:val="bullet"/>
+      <w:lvlText w:val=""/>
+      <w:lvlJc w:val="left"/>
+      <w:pPr>
+        <w:tabs>
+          <w:tab w:val="num" w:pos="3600"/>
+        </w:tabs>
+        <w:ind w:left="3600" w:hanging="360"/>
+      </w:pPr>
+      <w:rPr>
+        <w:rFonts w:ascii="Wingdings" w:hAnsi="Wingdings" w:hint="default"/>
+        <w:sz w:val="20"/>
+      </w:rPr>
+    </w:lvl>
+    <w:lvl w:ilvl="5" w:tentative="1">
+      <w:start w:val="1"/>
+      <w:numFmt w:val="bullet"/>
+      <w:lvlText w:val=""/>
+      <w:lvlJc w:val="left"/>
+      <w:pPr>
+        <w:tabs>
+          <w:tab w:val="num" w:pos="4320"/>
+        </w:tabs>
+        <w:ind w:left="4320" w:hanging="360"/>
+      </w:pPr>
+      <w:rPr>
+        <w:rFonts w:ascii="Wingdings" w:hAnsi="Wingdings" w:hint="default"/>
+        <w:sz w:val="20"/>
+      </w:rPr>
+    </w:lvl>
+    <w:lvl w:ilvl="6" w:tentative="1">
+      <w:start w:val="1"/>
+      <w:numFmt w:val="bullet"/>
+      <w:lvlText w:val=""/>
+      <w:lvlJc w:val="left"/>
+      <w:pPr>
+        <w:tabs>
+          <w:tab w:val="num" w:pos="5040"/>
+        </w:tabs>
+        <w:ind w:left="5040" w:hanging="360"/>
+      </w:pPr>
+      <w:rPr>
+        <w:rFonts w:ascii="Wingdings" w:hAnsi="Wingdings" w:hint="default"/>
+        <w:sz w:val="20"/>
+      </w:rPr>
+    </w:lvl>
+    <w:lvl w:ilvl="7" w:tentative="1">
+      <w:start w:val="1"/>
+      <w:numFmt w:val="bullet"/>
+      <w:lvlText w:val=""/>
+      <w:lvlJc w:val="left"/>
+      <w:pPr>
+        <w:tabs>
+          <w:tab w:val="num" w:pos="5760"/>
+        </w:tabs>
+        <w:ind w:left="5760" w:hanging="360"/>
+      </w:pPr>
+      <w:rPr>
+        <w:rFonts w:ascii="Wingdings" w:hAnsi="Wingdings" w:hint="default"/>
+        <w:sz w:val="20"/>
+      </w:rPr>
+    </w:lvl>
+    <w:lvl w:ilvl="8" w:tentative="1">
+      <w:start w:val="1"/>
+      <w:numFmt w:val="bullet"/>
+      <w:lvlText w:val=""/>
+      <w:lvlJc w:val="left"/>
+      <w:pPr>
+        <w:tabs>
+          <w:tab w:val="num" w:pos="6480"/>
+        </w:tabs>
+        <w:ind w:left="6480" w:hanging="360"/>
+      </w:pPr>
+      <w:rPr>
+        <w:rFonts w:ascii="Wingdings" w:hAnsi="Wingdings" w:hint="default"/>
+        <w:sz w:val="20"/>
+      </w:rPr>
+    </w:lvl>
+  </w:abstractNum>
+  <w:abstractNum w:abstractNumId="4">
     <w:nsid w:val="2CDD548A"/>
     <w:multiLevelType w:val="multilevel"/>
     <w:tmpl w:val="D73EE7C8"/>
@@ -1452,7 +1833,7 @@
       </w:rPr>
     </w:lvl>
   </w:abstractNum>
-  <w:abstractNum w:abstractNumId="4">
+  <w:abstractNum w:abstractNumId="5">
     <w:nsid w:val="3966507F"/>
     <w:multiLevelType w:val="multilevel"/>
     <w:tmpl w:val="A30A43C6"/>
@@ -1601,7 +1982,7 @@
       </w:rPr>
     </w:lvl>
   </w:abstractNum>
-  <w:abstractNum w:abstractNumId="5">
+  <w:abstractNum w:abstractNumId="6">
     <w:nsid w:val="45852FD7"/>
     <w:multiLevelType w:val="multilevel"/>
     <w:tmpl w:val="2DA69F80"/>
@@ -1750,7 +2131,7 @@
       </w:rPr>
     </w:lvl>
   </w:abstractNum>
-  <w:abstractNum w:abstractNumId="6">
+  <w:abstractNum w:abstractNumId="7">
     <w:nsid w:val="46864437"/>
     <w:multiLevelType w:val="multilevel"/>
     <w:tmpl w:val="64428FAC"/>
@@ -1899,7 +2280,7 @@
       </w:rPr>
     </w:lvl>
   </w:abstractNum>
-  <w:abstractNum w:abstractNumId="7">
+  <w:abstractNum w:abstractNumId="8">
     <w:nsid w:val="487610BE"/>
     <w:multiLevelType w:val="multilevel"/>
     <w:tmpl w:val="0C16F1B0"/>
@@ -2048,7 +2429,7 @@
       </w:rPr>
     </w:lvl>
   </w:abstractNum>
-  <w:abstractNum w:abstractNumId="8">
+  <w:abstractNum w:abstractNumId="9">
     <w:nsid w:val="49114545"/>
     <w:multiLevelType w:val="multilevel"/>
     <w:tmpl w:val="344E14E4"/>
@@ -2197,7 +2578,7 @@
       </w:rPr>
     </w:lvl>
   </w:abstractNum>
-  <w:abstractNum w:abstractNumId="9">
+  <w:abstractNum w:abstractNumId="10">
     <w:nsid w:val="4CA806D5"/>
     <w:multiLevelType w:val="multilevel"/>
     <w:tmpl w:val="9574EB82"/>
@@ -2346,7 +2727,7 @@
       </w:rPr>
     </w:lvl>
   </w:abstractNum>
-  <w:abstractNum w:abstractNumId="10">
+  <w:abstractNum w:abstractNumId="11">
     <w:nsid w:val="57035620"/>
     <w:multiLevelType w:val="multilevel"/>
     <w:tmpl w:val="C8563022"/>
@@ -2508,31 +2889,34 @@
     <w:abstractNumId w:val="1"/>
   </w:num>
   <w:num w:numId="5">
-    <w:abstractNumId w:val="7"/>
+    <w:abstractNumId w:val="8"/>
   </w:num>
   <w:num w:numId="6">
-    <w:abstractNumId w:val="9"/>
+    <w:abstractNumId w:val="10"/>
   </w:num>
   <w:num w:numId="7">
-    <w:abstractNumId w:val="6"/>
+    <w:abstractNumId w:val="7"/>
   </w:num>
   <w:num w:numId="8">
     <w:abstractNumId w:val="2"/>
   </w:num>
   <w:num w:numId="9">
+    <w:abstractNumId w:val="6"/>
+  </w:num>
+  <w:num w:numId="10">
     <w:abstractNumId w:val="5"/>
   </w:num>
-  <w:num w:numId="10">
+  <w:num w:numId="11">
     <w:abstractNumId w:val="4"/>
   </w:num>
-  <w:num w:numId="11">
-    <w:abstractNumId w:val="3"/>
-  </w:num>
   <w:num w:numId="12">
-    <w:abstractNumId w:val="8"/>
+    <w:abstractNumId w:val="9"/>
   </w:num>
   <w:num w:numId="13">
-    <w:abstractNumId w:val="10"/>
+    <w:abstractNumId w:val="11"/>
+  </w:num>
+  <w:num w:numId="14">
+    <w:abstractNumId w:val="3"/>
   </w:num>
 </w:numbering>
 </file>
@@ -2555,10 +2939,10 @@
     </w:pPrDefault>
   </w:docDefaults>
   <w:latentStyles w:defLockedState="0" w:defUIPriority="0" w:defSemiHidden="1" w:defUnhideWhenUsed="1" w:defQFormat="0" w:count="267">
-    <w:lsdException w:name="Normal" w:semiHidden="0" w:unhideWhenUsed="0"/>
+    <w:lsdException w:name="Normal" w:semiHidden="0" w:unhideWhenUsed="0" w:qFormat="1"/>
     <w:lsdException w:name="heading 1" w:semiHidden="0" w:unhideWhenUsed="0"/>
     <w:lsdException w:name="heading 2" w:semiHidden="0" w:unhideWhenUsed="0"/>
-    <w:lsdException w:name="heading 3" w:semiHidden="0" w:unhideWhenUsed="0"/>
+    <w:lsdException w:name="heading 3" w:semiHidden="0" w:uiPriority="9" w:unhideWhenUsed="0" w:qFormat="1"/>
     <w:lsdException w:name="heading 4" w:semiHidden="0" w:unhideWhenUsed="0"/>
     <w:lsdException w:name="heading 5" w:semiHidden="0" w:unhideWhenUsed="0"/>
     <w:lsdException w:name="heading 6" w:semiHidden="0" w:unhideWhenUsed="0"/>
@@ -2687,6 +3071,7 @@
   <w:style w:type="paragraph" w:default="1" w:styleId="Normal">
     <w:name w:val="Normal"/>
     <w:qFormat/>
+    <w:rsid w:val="00741D58"/>
   </w:style>
   <w:style w:type="paragraph" w:styleId="Heading1">
     <w:name w:val="heading 1"/>
@@ -2738,7 +3123,6 @@
     <w:next w:val="BodyText"/>
     <w:link w:val="Heading3Char"/>
     <w:uiPriority w:val="9"/>
-    <w:semiHidden/>
     <w:unhideWhenUsed/>
     <w:qFormat/>
     <w:rsid w:val="00A10FD9"/>
@@ -3093,7 +3477,6 @@
     <w:basedOn w:val="DefaultParagraphFont"/>
     <w:link w:val="Heading3"/>
     <w:uiPriority w:val="9"/>
-    <w:semiHidden/>
     <w:rsid w:val="00A10FD9"/>
     <w:rPr>
       <w:rFonts w:eastAsiaTheme="majorEastAsia" w:cstheme="majorBidi"/>
@@ -4140,7 +4523,7 @@
   <a:extraClrSchemeLst/>
   <a:extLst>
     <a:ext uri="{05A4C25C-085E-4340-85A3-A5531E510DB2}">
-      <thm15:themeFamily xmlns:thm15="http://schemas.microsoft.com/office/thememl/2012/main" xmlns="" name="Office Theme" id="{2E142A2C-CD16-42D6-873A-C26D2A0506FA}" vid="{1BDDFF52-6CD6-40A5-AB3C-68EB2F1E4D0A}"/>
+      <thm15:themeFamily xmlns="" xmlns:thm15="http://schemas.microsoft.com/office/thememl/2012/main" name="Office Theme" id="{2E142A2C-CD16-42D6-873A-C26D2A0506FA}" vid="{1BDDFF52-6CD6-40A5-AB3C-68EB2F1E4D0A}"/>
     </a:ext>
   </a:extLst>
 </a:theme>
@@ -4151,7 +4534,7 @@
 </file>
 
 <file path=customXml/itemProps1.xml><?xml version="1.0" encoding="utf-8"?>
-<ds:datastoreItem xmlns:ds="http://schemas.openxmlformats.org/officeDocument/2006/customXml" ds:itemID="{5DFB42B2-B06C-4417-B3DE-E56A89CD51B3}">
+<ds:datastoreItem xmlns:ds="http://schemas.openxmlformats.org/officeDocument/2006/customXml" ds:itemID="{090EFCA9-32EE-4A3D-8AF9-93FCBEFE0FC5}">
   <ds:schemaRefs>
     <ds:schemaRef ds:uri="http://schemas.openxmlformats.org/officeDocument/2006/bibliography"/>
   </ds:schemaRefs>

</xml_diff>